<commit_message>
Regenerate the Word PRD after the agentic RAG section
Also gitignores node_modules, since regenerating the .docx needs a local
npm install docx and that should not follow the Django project into the repo.

Co-Authored-By: Claude Opus 5 <noreply@anthropic.com>
</commit_message>
<xml_diff>
--- a/docs/Capstone2_PRD_Surgical_Oncology_Dashboard.docx
+++ b/docs/Capstone2_PRD_Surgical_Oncology_Dashboard.docx
@@ -11212,10 +11212,10 @@
           <w:b/>
           <w:bCs/>
         </w:rPr>
-        <w:t xml:space="preserve">The judge metric did not improve, and that is the honest result.</w:t>
-      </w:r>
-      <w:r>
-        <w:t xml:space="preserve"> Two cases remain marked inappropriate, and at least one is a real weakness rather than judge pedantry: for an ER 95% / PR 80% / HER2-negative early breast cancer the suggestion led with adjuvant chemotherapy where endocrine therapy is standard. The retrieval fix addressed </w:t>
+        <w:t xml:space="preserve">The judge metric did not improve from the retrieval fix, and that is the honest result.</w:t>
+      </w:r>
+      <w:r>
+        <w:t xml:space="preserve"> Retrieval addressed </w:t>
       </w:r>
       <w:r>
         <w:rPr>
@@ -11235,7 +11235,723 @@
         <w:t xml:space="preserve">clinical judgement within a correctly retrieved guideline</w:t>
       </w:r>
       <w:r>
-        <w:t xml:space="preserve">. That remains open.</w:t>
+        <w:t xml:space="preserve">.</w:t>
+      </w:r>
+    </w:p>
+    <w:p>
+      <w:pPr>
+        <w:pStyle w:val="Heading3"/>
+        <w:keepNext/>
+        <w:spacing w:after="130" w:before="260"/>
+      </w:pPr>
+      <w:r>
+        <w:t xml:space="preserve">Agentic RAG — grade-and-retry</w:t>
+      </w:r>
+    </w:p>
+    <w:p>
+      <w:pPr>
+        <w:spacing w:after="130" w:line="276"/>
+      </w:pPr>
+      <w:r>
+        <w:t xml:space="preserve">The Session 6 self-check (</w:t>
+      </w:r>
+      <w:r>
+        <w:rPr>
+          <w:rFonts w:ascii="Consolas" w:cs="Consolas" w:eastAsia="Consolas" w:hAnsi="Consolas"/>
+          <w:color w:val="9A281B"/>
+          <w:sz w:val="18"/>
+          <w:szCs w:val="18"/>
+        </w:rPr>
+        <w:t xml:space="preserve">ai/rag/agentic_rag.py</w:t>
+      </w:r>
+      <w:r>
+        <w:t xml:space="preserve">) is wired into decision suggestions: the draft is graded against its own passages — is every claim supported? — and rewritten with the grader's objection if not, up to twice.</w:t>
+      </w:r>
+    </w:p>
+    <w:p>
+      <w:pPr>
+        <w:spacing w:after="130" w:line="276"/>
+      </w:pPr>
+      <w:r>
+        <w:t xml:space="preserve">The </w:t>
+      </w:r>
+      <w:r>
+        <w:rPr>
+          <w:b/>
+          <w:bCs/>
+        </w:rPr>
+        <w:t xml:space="preserve">grader</w:t>
+      </w:r>
+      <w:r>
+        <w:t xml:space="preserve"> is reused as-is. The </w:t>
+      </w:r>
+      <w:r>
+        <w:rPr>
+          <w:b/>
+          <w:bCs/>
+        </w:rPr>
+        <w:t xml:space="preserve">retry</w:t>
+      </w:r>
+      <w:r>
+        <w:t xml:space="preserve"> is written here rather than reused, because the Session 6 version rewrites against that module's generic prompt; reusing it would throw away the rules that stop this system proposing a treatment the patient has already had.</w:t>
+      </w:r>
+    </w:p>
+    <w:p>
+      <w:pPr>
+        <w:spacing w:after="130" w:line="276"/>
+      </w:pPr>
+      <w:r>
+        <w:t xml:space="preserve">Measured with </w:t>
+      </w:r>
+      <w:r>
+        <w:rPr>
+          <w:rFonts w:ascii="Consolas" w:cs="Consolas" w:eastAsia="Consolas" w:hAnsi="Consolas"/>
+          <w:color w:val="9A281B"/>
+          <w:sz w:val="18"/>
+          <w:szCs w:val="18"/>
+        </w:rPr>
+        <w:t xml:space="preserve">eval_guidelines --agentic --judge</w:t>
+      </w:r>
+      <w:r>
+        <w:t xml:space="preserve"> against the same 12 cases:</w:t>
+      </w:r>
+    </w:p>
+    <w:tbl>
+      <w:tblPr>
+        <w:tblW w:type="dxa" w:w="10080"/>
+        <w:tblBorders>
+          <w:top w:val="single" w:color="auto" w:sz="4"/>
+          <w:left w:val="single" w:color="auto" w:sz="4"/>
+          <w:bottom w:val="single" w:color="auto" w:sz="4"/>
+          <w:right w:val="single" w:color="auto" w:sz="4"/>
+          <w:insideH w:val="single" w:color="auto" w:sz="4"/>
+          <w:insideV w:val="single" w:color="auto" w:sz="4"/>
+        </w:tblBorders>
+      </w:tblPr>
+      <w:tblGrid>
+        <w:gridCol w:w="3360"/>
+        <w:gridCol w:w="3360"/>
+        <w:gridCol w:w="3360"/>
+      </w:tblGrid>
+      <w:tr>
+        <w:trPr>
+          <w:tblHeader/>
+        </w:trPr>
+        <w:tc>
+          <w:tcPr>
+            <w:tcW w:type="dxa" w:w="3360"/>
+            <w:shd w:fill="028090" w:val="clear"/>
+            <w:tcMar>
+              <w:top w:type="dxa" w:w="70"/>
+              <w:left w:type="dxa" w:w="110"/>
+              <w:bottom w:type="dxa" w:w="70"/>
+              <w:right w:type="dxa" w:w="110"/>
+            </w:tcMar>
+          </w:tcPr>
+          <w:p>
+            <w:pPr>
+              <w:spacing w:after="0" w:line="250"/>
+            </w:pPr>
+            <w:r>
+              <w:rPr>
+                <w:b/>
+                <w:bCs/>
+                <w:color w:val="FFFFFF"/>
+                <w:sz w:val="18"/>
+                <w:szCs w:val="18"/>
+              </w:rPr>
+              <w:t xml:space="preserve">Metric</w:t>
+            </w:r>
+          </w:p>
+        </w:tc>
+        <w:tc>
+          <w:tcPr>
+            <w:tcW w:type="dxa" w:w="3360"/>
+            <w:shd w:fill="028090" w:val="clear"/>
+            <w:tcMar>
+              <w:top w:type="dxa" w:w="70"/>
+              <w:left w:type="dxa" w:w="110"/>
+              <w:bottom w:type="dxa" w:w="70"/>
+              <w:right w:type="dxa" w:w="110"/>
+            </w:tcMar>
+          </w:tcPr>
+          <w:p>
+            <w:pPr>
+              <w:spacing w:after="0" w:line="250"/>
+            </w:pPr>
+            <w:r>
+              <w:rPr>
+                <w:b/>
+                <w:bCs/>
+                <w:color w:val="FFFFFF"/>
+                <w:sz w:val="18"/>
+                <w:szCs w:val="18"/>
+              </w:rPr>
+              <w:t xml:space="preserve">Single-shot</w:t>
+            </w:r>
+          </w:p>
+        </w:tc>
+        <w:tc>
+          <w:tcPr>
+            <w:tcW w:type="dxa" w:w="3360"/>
+            <w:shd w:fill="028090" w:val="clear"/>
+            <w:tcMar>
+              <w:top w:type="dxa" w:w="70"/>
+              <w:left w:type="dxa" w:w="110"/>
+              <w:bottom w:type="dxa" w:w="70"/>
+              <w:right w:type="dxa" w:w="110"/>
+            </w:tcMar>
+          </w:tcPr>
+          <w:p>
+            <w:pPr>
+              <w:spacing w:after="0" w:line="250"/>
+            </w:pPr>
+            <w:r>
+              <w:rPr>
+                <w:b/>
+                <w:bCs/>
+                <w:color w:val="FFFFFF"/>
+                <w:sz w:val="18"/>
+                <w:szCs w:val="18"/>
+              </w:rPr>
+              <w:t xml:space="preserve">Grade-and-retry</w:t>
+            </w:r>
+          </w:p>
+        </w:tc>
+      </w:tr>
+      <w:tr>
+        <w:tc>
+          <w:tcPr>
+            <w:tcW w:type="dxa" w:w="3360"/>
+            <w:shd w:fill="FFFFFF" w:val="clear"/>
+            <w:tcMar>
+              <w:top w:type="dxa" w:w="70"/>
+              <w:left w:type="dxa" w:w="110"/>
+              <w:bottom w:type="dxa" w:w="70"/>
+              <w:right w:type="dxa" w:w="110"/>
+            </w:tcMar>
+          </w:tcPr>
+          <w:p>
+            <w:pPr>
+              <w:spacing w:after="0" w:line="250"/>
+            </w:pPr>
+            <w:r>
+              <w:rPr>
+                <w:sz w:val="18"/>
+                <w:szCs w:val="18"/>
+              </w:rPr>
+              <w:t xml:space="preserve">Refusal calibration</w:t>
+            </w:r>
+          </w:p>
+        </w:tc>
+        <w:tc>
+          <w:tcPr>
+            <w:tcW w:type="dxa" w:w="3360"/>
+            <w:shd w:fill="FFFFFF" w:val="clear"/>
+            <w:tcMar>
+              <w:top w:type="dxa" w:w="70"/>
+              <w:left w:type="dxa" w:w="110"/>
+              <w:bottom w:type="dxa" w:w="70"/>
+              <w:right w:type="dxa" w:w="110"/>
+            </w:tcMar>
+          </w:tcPr>
+          <w:p>
+            <w:pPr>
+              <w:spacing w:after="0" w:line="250"/>
+            </w:pPr>
+            <w:r>
+              <w:rPr>
+                <w:sz w:val="18"/>
+                <w:szCs w:val="18"/>
+              </w:rPr>
+              <w:t xml:space="preserve">12/12</w:t>
+            </w:r>
+          </w:p>
+        </w:tc>
+        <w:tc>
+          <w:tcPr>
+            <w:tcW w:type="dxa" w:w="3360"/>
+            <w:shd w:fill="FFFFFF" w:val="clear"/>
+            <w:tcMar>
+              <w:top w:type="dxa" w:w="70"/>
+              <w:left w:type="dxa" w:w="110"/>
+              <w:bottom w:type="dxa" w:w="70"/>
+              <w:right w:type="dxa" w:w="110"/>
+            </w:tcMar>
+          </w:tcPr>
+          <w:p>
+            <w:pPr>
+              <w:spacing w:after="0" w:line="250"/>
+            </w:pPr>
+            <w:r>
+              <w:rPr>
+                <w:sz w:val="18"/>
+                <w:szCs w:val="18"/>
+              </w:rPr>
+              <w:t xml:space="preserve">12/12</w:t>
+            </w:r>
+          </w:p>
+        </w:tc>
+      </w:tr>
+      <w:tr>
+        <w:tc>
+          <w:tcPr>
+            <w:tcW w:type="dxa" w:w="3360"/>
+            <w:shd w:fill="FFFFFF" w:val="clear"/>
+            <w:tcMar>
+              <w:top w:type="dxa" w:w="70"/>
+              <w:left w:type="dxa" w:w="110"/>
+              <w:bottom w:type="dxa" w:w="70"/>
+              <w:right w:type="dxa" w:w="110"/>
+            </w:tcMar>
+          </w:tcPr>
+          <w:p>
+            <w:pPr>
+              <w:spacing w:after="0" w:line="250"/>
+            </w:pPr>
+            <w:r>
+              <w:rPr>
+                <w:sz w:val="18"/>
+                <w:szCs w:val="18"/>
+              </w:rPr>
+              <w:t xml:space="preserve">Source correctness</w:t>
+            </w:r>
+          </w:p>
+        </w:tc>
+        <w:tc>
+          <w:tcPr>
+            <w:tcW w:type="dxa" w:w="3360"/>
+            <w:shd w:fill="FFFFFF" w:val="clear"/>
+            <w:tcMar>
+              <w:top w:type="dxa" w:w="70"/>
+              <w:left w:type="dxa" w:w="110"/>
+              <w:bottom w:type="dxa" w:w="70"/>
+              <w:right w:type="dxa" w:w="110"/>
+            </w:tcMar>
+          </w:tcPr>
+          <w:p>
+            <w:pPr>
+              <w:spacing w:after="0" w:line="250"/>
+            </w:pPr>
+            <w:r>
+              <w:rPr>
+                <w:sz w:val="18"/>
+                <w:szCs w:val="18"/>
+              </w:rPr>
+              <w:t xml:space="preserve">12/12</w:t>
+            </w:r>
+          </w:p>
+        </w:tc>
+        <w:tc>
+          <w:tcPr>
+            <w:tcW w:type="dxa" w:w="3360"/>
+            <w:shd w:fill="FFFFFF" w:val="clear"/>
+            <w:tcMar>
+              <w:top w:type="dxa" w:w="70"/>
+              <w:left w:type="dxa" w:w="110"/>
+              <w:bottom w:type="dxa" w:w="70"/>
+              <w:right w:type="dxa" w:w="110"/>
+            </w:tcMar>
+          </w:tcPr>
+          <w:p>
+            <w:pPr>
+              <w:spacing w:after="0" w:line="250"/>
+            </w:pPr>
+            <w:r>
+              <w:rPr>
+                <w:sz w:val="18"/>
+                <w:szCs w:val="18"/>
+              </w:rPr>
+              <w:t xml:space="preserve">12/12</w:t>
+            </w:r>
+          </w:p>
+        </w:tc>
+      </w:tr>
+      <w:tr>
+        <w:tc>
+          <w:tcPr>
+            <w:tcW w:type="dxa" w:w="3360"/>
+            <w:shd w:fill="FFFFFF" w:val="clear"/>
+            <w:tcMar>
+              <w:top w:type="dxa" w:w="70"/>
+              <w:left w:type="dxa" w:w="110"/>
+              <w:bottom w:type="dxa" w:w="70"/>
+              <w:right w:type="dxa" w:w="110"/>
+            </w:tcMar>
+          </w:tcPr>
+          <w:p>
+            <w:pPr>
+              <w:spacing w:after="0" w:line="250"/>
+            </w:pPr>
+            <w:r>
+              <w:rPr>
+                <w:sz w:val="18"/>
+                <w:szCs w:val="18"/>
+              </w:rPr>
+              <w:t xml:space="preserve">History safety</w:t>
+            </w:r>
+          </w:p>
+        </w:tc>
+        <w:tc>
+          <w:tcPr>
+            <w:tcW w:type="dxa" w:w="3360"/>
+            <w:shd w:fill="FFFFFF" w:val="clear"/>
+            <w:tcMar>
+              <w:top w:type="dxa" w:w="70"/>
+              <w:left w:type="dxa" w:w="110"/>
+              <w:bottom w:type="dxa" w:w="70"/>
+              <w:right w:type="dxa" w:w="110"/>
+            </w:tcMar>
+          </w:tcPr>
+          <w:p>
+            <w:pPr>
+              <w:spacing w:after="0" w:line="250"/>
+            </w:pPr>
+            <w:r>
+              <w:rPr>
+                <w:sz w:val="18"/>
+                <w:szCs w:val="18"/>
+              </w:rPr>
+              <w:t xml:space="preserve">8/8</w:t>
+            </w:r>
+          </w:p>
+        </w:tc>
+        <w:tc>
+          <w:tcPr>
+            <w:tcW w:type="dxa" w:w="3360"/>
+            <w:shd w:fill="FFFFFF" w:val="clear"/>
+            <w:tcMar>
+              <w:top w:type="dxa" w:w="70"/>
+              <w:left w:type="dxa" w:w="110"/>
+              <w:bottom w:type="dxa" w:w="70"/>
+              <w:right w:type="dxa" w:w="110"/>
+            </w:tcMar>
+          </w:tcPr>
+          <w:p>
+            <w:pPr>
+              <w:spacing w:after="0" w:line="250"/>
+            </w:pPr>
+            <w:r>
+              <w:rPr>
+                <w:sz w:val="18"/>
+                <w:szCs w:val="18"/>
+              </w:rPr>
+              <w:t xml:space="preserve">8/8</w:t>
+            </w:r>
+          </w:p>
+        </w:tc>
+      </w:tr>
+      <w:tr>
+        <w:tc>
+          <w:tcPr>
+            <w:tcW w:type="dxa" w:w="3360"/>
+            <w:shd w:fill="FFFFFF" w:val="clear"/>
+            <w:tcMar>
+              <w:top w:type="dxa" w:w="70"/>
+              <w:left w:type="dxa" w:w="110"/>
+              <w:bottom w:type="dxa" w:w="70"/>
+              <w:right w:type="dxa" w:w="110"/>
+            </w:tcMar>
+          </w:tcPr>
+          <w:p>
+            <w:pPr>
+              <w:spacing w:after="0" w:line="250"/>
+            </w:pPr>
+            <w:r>
+              <w:rPr>
+                <w:b/>
+                <w:bCs/>
+                <w:sz w:val="18"/>
+                <w:szCs w:val="18"/>
+              </w:rPr>
+              <w:t xml:space="preserve">Judge: appropriate</w:t>
+            </w:r>
+          </w:p>
+        </w:tc>
+        <w:tc>
+          <w:tcPr>
+            <w:tcW w:type="dxa" w:w="3360"/>
+            <w:shd w:fill="FFFFFF" w:val="clear"/>
+            <w:tcMar>
+              <w:top w:type="dxa" w:w="70"/>
+              <w:left w:type="dxa" w:w="110"/>
+              <w:bottom w:type="dxa" w:w="70"/>
+              <w:right w:type="dxa" w:w="110"/>
+            </w:tcMar>
+          </w:tcPr>
+          <w:p>
+            <w:pPr>
+              <w:spacing w:after="0" w:line="250"/>
+            </w:pPr>
+            <w:r>
+              <w:rPr>
+                <w:sz w:val="18"/>
+                <w:szCs w:val="18"/>
+              </w:rPr>
+              <w:t xml:space="preserve">6/8 (75%)</w:t>
+            </w:r>
+          </w:p>
+        </w:tc>
+        <w:tc>
+          <w:tcPr>
+            <w:tcW w:type="dxa" w:w="3360"/>
+            <w:shd w:fill="FFFFFF" w:val="clear"/>
+            <w:tcMar>
+              <w:top w:type="dxa" w:w="70"/>
+              <w:left w:type="dxa" w:w="110"/>
+              <w:bottom w:type="dxa" w:w="70"/>
+              <w:right w:type="dxa" w:w="110"/>
+            </w:tcMar>
+          </w:tcPr>
+          <w:p>
+            <w:pPr>
+              <w:spacing w:after="0" w:line="250"/>
+            </w:pPr>
+            <w:r>
+              <w:rPr>
+                <w:b/>
+                <w:bCs/>
+                <w:sz w:val="18"/>
+                <w:szCs w:val="18"/>
+              </w:rPr>
+              <w:t xml:space="preserve">7/8 (87%)</w:t>
+            </w:r>
+          </w:p>
+        </w:tc>
+      </w:tr>
+      <w:tr>
+        <w:tc>
+          <w:tcPr>
+            <w:tcW w:type="dxa" w:w="3360"/>
+            <w:shd w:fill="FFFFFF" w:val="clear"/>
+            <w:tcMar>
+              <w:top w:type="dxa" w:w="70"/>
+              <w:left w:type="dxa" w:w="110"/>
+              <w:bottom w:type="dxa" w:w="70"/>
+              <w:right w:type="dxa" w:w="110"/>
+            </w:tcMar>
+          </w:tcPr>
+          <w:p>
+            <w:pPr>
+              <w:spacing w:after="0" w:line="250"/>
+            </w:pPr>
+            <w:r>
+              <w:rPr>
+                <w:sz w:val="18"/>
+                <w:szCs w:val="18"/>
+              </w:rPr>
+              <w:t xml:space="preserve">Grader passed</w:t>
+            </w:r>
+          </w:p>
+        </w:tc>
+        <w:tc>
+          <w:tcPr>
+            <w:tcW w:type="dxa" w:w="3360"/>
+            <w:shd w:fill="FFFFFF" w:val="clear"/>
+            <w:tcMar>
+              <w:top w:type="dxa" w:w="70"/>
+              <w:left w:type="dxa" w:w="110"/>
+              <w:bottom w:type="dxa" w:w="70"/>
+              <w:right w:type="dxa" w:w="110"/>
+            </w:tcMar>
+          </w:tcPr>
+          <w:p>
+            <w:pPr>
+              <w:spacing w:after="0" w:line="250"/>
+            </w:pPr>
+            <w:r>
+              <w:rPr>
+                <w:sz w:val="18"/>
+                <w:szCs w:val="18"/>
+              </w:rPr>
+              <w:t xml:space="preserve">—</w:t>
+            </w:r>
+          </w:p>
+        </w:tc>
+        <w:tc>
+          <w:tcPr>
+            <w:tcW w:type="dxa" w:w="3360"/>
+            <w:shd w:fill="FFFFFF" w:val="clear"/>
+            <w:tcMar>
+              <w:top w:type="dxa" w:w="70"/>
+              <w:left w:type="dxa" w:w="110"/>
+              <w:bottom w:type="dxa" w:w="70"/>
+              <w:right w:type="dxa" w:w="110"/>
+            </w:tcMar>
+          </w:tcPr>
+          <w:p>
+            <w:pPr>
+              <w:spacing w:after="0" w:line="250"/>
+            </w:pPr>
+            <w:r>
+              <w:rPr>
+                <w:sz w:val="18"/>
+                <w:szCs w:val="18"/>
+              </w:rPr>
+              <w:t xml:space="preserve">5/8 (62%)</w:t>
+            </w:r>
+          </w:p>
+        </w:tc>
+      </w:tr>
+      <w:tr>
+        <w:tc>
+          <w:tcPr>
+            <w:tcW w:type="dxa" w:w="3360"/>
+            <w:shd w:fill="FFFFFF" w:val="clear"/>
+            <w:tcMar>
+              <w:top w:type="dxa" w:w="70"/>
+              <w:left w:type="dxa" w:w="110"/>
+              <w:bottom w:type="dxa" w:w="70"/>
+              <w:right w:type="dxa" w:w="110"/>
+            </w:tcMar>
+          </w:tcPr>
+          <w:p>
+            <w:pPr>
+              <w:spacing w:after="0" w:line="250"/>
+            </w:pPr>
+            <w:r>
+              <w:rPr>
+                <w:sz w:val="18"/>
+                <w:szCs w:val="18"/>
+              </w:rPr>
+              <w:t xml:space="preserve">Answers rewritten</w:t>
+            </w:r>
+          </w:p>
+        </w:tc>
+        <w:tc>
+          <w:tcPr>
+            <w:tcW w:type="dxa" w:w="3360"/>
+            <w:shd w:fill="FFFFFF" w:val="clear"/>
+            <w:tcMar>
+              <w:top w:type="dxa" w:w="70"/>
+              <w:left w:type="dxa" w:w="110"/>
+              <w:bottom w:type="dxa" w:w="70"/>
+              <w:right w:type="dxa" w:w="110"/>
+            </w:tcMar>
+          </w:tcPr>
+          <w:p>
+            <w:pPr>
+              <w:spacing w:after="0" w:line="250"/>
+            </w:pPr>
+            <w:r>
+              <w:rPr>
+                <w:sz w:val="18"/>
+                <w:szCs w:val="18"/>
+              </w:rPr>
+              <w:t xml:space="preserve">—</w:t>
+            </w:r>
+          </w:p>
+        </w:tc>
+        <w:tc>
+          <w:tcPr>
+            <w:tcW w:type="dxa" w:w="3360"/>
+            <w:shd w:fill="FFFFFF" w:val="clear"/>
+            <w:tcMar>
+              <w:top w:type="dxa" w:w="70"/>
+              <w:left w:type="dxa" w:w="110"/>
+              <w:bottom w:type="dxa" w:w="70"/>
+              <w:right w:type="dxa" w:w="110"/>
+            </w:tcMar>
+          </w:tcPr>
+          <w:p>
+            <w:pPr>
+              <w:spacing w:after="0" w:line="250"/>
+            </w:pPr>
+            <w:r>
+              <w:rPr>
+                <w:sz w:val="18"/>
+                <w:szCs w:val="18"/>
+              </w:rPr>
+              <w:t xml:space="preserve">4 of 8</w:t>
+            </w:r>
+          </w:p>
+        </w:tc>
+      </w:tr>
+    </w:tbl>
+    <w:p>
+      <w:pPr>
+        <w:spacing w:after="160"/>
+      </w:pPr>
+      <w:r>
+        <w:t xml:space="preserve"/>
+      </w:r>
+    </w:p>
+    <w:p>
+      <w:pPr>
+        <w:spacing w:after="130" w:line="276"/>
+      </w:pPr>
+      <w:r>
+        <w:rPr>
+          <w:b/>
+          <w:bCs/>
+        </w:rPr>
+        <w:t xml:space="preserve">What it bought.</w:t>
+      </w:r>
+      <w:r>
+        <w:t xml:space="preserve"> One case genuinely improved: the patient seven of eight cycles into NACT was previously given a plan that assumed the course was finished; the rewrite fixed it. The deterministic metrics are unchanged, as expected — grading cannot affect what was retrieved.</w:t>
+      </w:r>
+    </w:p>
+    <w:p>
+      <w:pPr>
+        <w:spacing w:after="130" w:line="276"/>
+      </w:pPr>
+      <w:r>
+        <w:rPr>
+          <w:b/>
+          <w:bCs/>
+        </w:rPr>
+        <w:t xml:space="preserve">What it cost, and what it did not fix.</w:t>
+      </w:r>
+      <w:r>
+        <w:t xml:space="preserve"> Roughly two to three times the API calls on a decision suggestion. And the ER 95% / HER2-negative case still leads with adjuvant chemotherapy where endocrine therapy is standard — the grader</w:t>
+      </w:r>
+    </w:p>
+    <w:p>
+      <w:pPr>
+        <w:spacing w:after="130" w:line="276"/>
+      </w:pPr>
+      <w:r>
+        <w:rPr>
+          <w:i/>
+          <w:iCs/>
+        </w:rPr>
+        <w:t xml:space="preserve">flagged</w:t>
+      </w:r>
+      <w:r>
+        <w:t xml:space="preserve"> it and two rewrites did not fix it, because the grader can only check claims against the retrieved passages; it cannot supply knowledge that was never retrieved.</w:t>
+      </w:r>
+    </w:p>
+    <w:p>
+      <w:pPr>
+        <w:spacing w:after="130" w:line="276"/>
+      </w:pPr>
+      <w:r>
+        <w:rPr>
+          <w:b/>
+          <w:bCs/>
+        </w:rPr>
+        <w:t xml:space="preserve">The most useful output is the 62%.</w:t>
+      </w:r>
+      <w:r>
+        <w:t xml:space="preserve"> Three of eight answers are returned while the grader still objects. Rather than hide that, the page shows </w:t>
+      </w:r>
+      <w:r>
+        <w:rPr>
+          <w:i/>
+          <w:iCs/>
+        </w:rPr>
+        <w:t xml:space="preserve">self-check still objects</w:t>
+      </w:r>
+      <w:r>
+        <w:t xml:space="preserve"> with the objection, so a clinician knows which suggestions are the weakly-grounded ones. An answer the self-check cannot fully ground is exactly the one to read hardest.</w:t>
+      </w:r>
+    </w:p>
+    <w:p>
+      <w:pPr>
+        <w:spacing w:after="130" w:line="276"/>
+      </w:pPr>
+      <w:r>
+        <w:t xml:space="preserve">Workup suggestions stay single-shot: a list of investigation names gives the grader little to catch, and each round costs two more calls.</w:t>
       </w:r>
     </w:p>
     <w:p>

</xml_diff>

<commit_message>
Put the live URL and the demo accounts in the README and the PRD
The README opens with the link and the warning that Render's free tier sleeps,
so a first request taking a minute reads as waking rather than broken, and that
the free database is removed after thirty days — both things anyone following
the link needs before they conclude the app is down.

The account table is written from what the deployed instance actually returned,
not from the seed file: all nine were logged into and their patient counts and
scope recorded. It also notes there is deliberately no superuser, so /admin/
cannot be logged into.

Adds a short suggested tour, including that opening another team's patient
returns 404 — that is the access model working, and without saying so it looks
like a broken link.

217 tests pass.

Co-Authored-By: Claude Opus 5 <noreply@anthropic.com>
</commit_message>
<xml_diff>
--- a/docs/Capstone2_PRD_Surgical_Oncology_Dashboard.docx
+++ b/docs/Capstone2_PRD_Surgical_Oncology_Dashboard.docx
@@ -20877,6 +20877,50 @@
     </w:p>
     <w:p>
       <w:pPr>
+        <w:spacing w:after="130" w:line="276"/>
+      </w:pPr>
+      <w:r>
+        <w:rPr>
+          <w:b/>
+          <w:bCs/>
+        </w:rPr>
+        <w:t xml:space="preserve">Live demo: https://khcc-surgical-oncology-dashboard.onrender.com</w:t>
+      </w:r>
+      <w:r>
+        <w:t xml:space="preserve"> — sign in as</w:t>
+      </w:r>
+    </w:p>
+    <w:p>
+      <w:pPr>
+        <w:spacing w:after="130" w:line="276"/>
+      </w:pPr>
+      <w:r>
+        <w:rPr>
+          <w:rFonts w:ascii="Consolas" w:cs="Consolas" w:eastAsia="Consolas" w:hAnsi="Consolas"/>
+          <w:color w:val="9A281B"/>
+          <w:sz w:val="18"/>
+          <w:szCs w:val="18"/>
+        </w:rPr>
+        <w:t xml:space="preserve">prep1</w:t>
+      </w:r>
+      <w:r>
+        <w:t xml:space="preserve"> / </w:t>
+      </w:r>
+      <w:r>
+        <w:rPr>
+          <w:rFonts w:ascii="Consolas" w:cs="Consolas" w:eastAsia="Consolas" w:hAnsi="Consolas"/>
+          <w:color w:val="9A281B"/>
+          <w:sz w:val="18"/>
+          <w:szCs w:val="18"/>
+        </w:rPr>
+        <w:t xml:space="preserve">demo1234</w:t>
+      </w:r>
+      <w:r>
+        <w:t xml:space="preserve">. On Render's free tier the service sleeps after about fifteen minutes idle, so a first request can take a minute; the free database is removed after thirty days.</w:t>
+      </w:r>
+    </w:p>
+    <w:p>
+      <w:pPr>
         <w:shd w:fill="F2F5F5" w:val="clear"/>
         <w:spacing w:after="0" w:before="140"/>
         <w:ind w:left="200"/>
@@ -21021,10 +21065,724 @@
     </w:p>
     <w:p>
       <w:pPr>
+        <w:pStyle w:val="Heading3"/>
+        <w:keepNext/>
+        <w:spacing w:after="130" w:before="260"/>
+      </w:pPr>
+      <w:r>
+        <w:t xml:space="preserve">Demo accounts</w:t>
+      </w:r>
+    </w:p>
+    <w:p>
+      <w:pPr>
         <w:spacing w:after="130" w:line="276"/>
       </w:pPr>
       <w:r>
-        <w:t xml:space="preserve">Demo logins, password </w:t>
+        <w:t xml:space="preserve">The same accounts work locally and on the deployed instance.</w:t>
+      </w:r>
+    </w:p>
+    <w:tbl>
+      <w:tblPr>
+        <w:tblW w:type="dxa" w:w="10080"/>
+        <w:tblBorders>
+          <w:top w:val="single" w:color="auto" w:sz="4"/>
+          <w:left w:val="single" w:color="auto" w:sz="4"/>
+          <w:bottom w:val="single" w:color="auto" w:sz="4"/>
+          <w:right w:val="single" w:color="auto" w:sz="4"/>
+          <w:insideH w:val="single" w:color="auto" w:sz="4"/>
+          <w:insideV w:val="single" w:color="auto" w:sz="4"/>
+        </w:tblBorders>
+      </w:tblPr>
+      <w:tblGrid>
+        <w:gridCol w:w="3360"/>
+        <w:gridCol w:w="3360"/>
+        <w:gridCol w:w="3360"/>
+      </w:tblGrid>
+      <w:tr>
+        <w:trPr>
+          <w:tblHeader/>
+        </w:trPr>
+        <w:tc>
+          <w:tcPr>
+            <w:tcW w:type="dxa" w:w="3360"/>
+            <w:shd w:fill="028090" w:val="clear"/>
+            <w:tcMar>
+              <w:top w:type="dxa" w:w="70"/>
+              <w:left w:type="dxa" w:w="110"/>
+              <w:bottom w:type="dxa" w:w="70"/>
+              <w:right w:type="dxa" w:w="110"/>
+            </w:tcMar>
+          </w:tcPr>
+          <w:p>
+            <w:pPr>
+              <w:spacing w:after="0" w:line="250"/>
+            </w:pPr>
+            <w:r>
+              <w:rPr>
+                <w:b/>
+                <w:bCs/>
+                <w:color w:val="FFFFFF"/>
+                <w:sz w:val="18"/>
+                <w:szCs w:val="18"/>
+              </w:rPr>
+              <w:t xml:space="preserve">Account</w:t>
+            </w:r>
+          </w:p>
+        </w:tc>
+        <w:tc>
+          <w:tcPr>
+            <w:tcW w:type="dxa" w:w="3360"/>
+            <w:shd w:fill="028090" w:val="clear"/>
+            <w:tcMar>
+              <w:top w:type="dxa" w:w="70"/>
+              <w:left w:type="dxa" w:w="110"/>
+              <w:bottom w:type="dxa" w:w="70"/>
+              <w:right w:type="dxa" w:w="110"/>
+            </w:tcMar>
+          </w:tcPr>
+          <w:p>
+            <w:pPr>
+              <w:spacing w:after="0" w:line="250"/>
+            </w:pPr>
+            <w:r>
+              <w:rPr>
+                <w:b/>
+                <w:bCs/>
+                <w:color w:val="FFFFFF"/>
+                <w:sz w:val="18"/>
+                <w:szCs w:val="18"/>
+              </w:rPr>
+              <w:t xml:space="preserve">Role</w:t>
+            </w:r>
+          </w:p>
+        </w:tc>
+        <w:tc>
+          <w:tcPr>
+            <w:tcW w:type="dxa" w:w="3360"/>
+            <w:shd w:fill="028090" w:val="clear"/>
+            <w:tcMar>
+              <w:top w:type="dxa" w:w="70"/>
+              <w:left w:type="dxa" w:w="110"/>
+              <w:bottom w:type="dxa" w:w="70"/>
+              <w:right w:type="dxa" w:w="110"/>
+            </w:tcMar>
+          </w:tcPr>
+          <w:p>
+            <w:pPr>
+              <w:spacing w:after="0" w:line="250"/>
+            </w:pPr>
+            <w:r>
+              <w:rPr>
+                <w:b/>
+                <w:bCs/>
+                <w:color w:val="FFFFFF"/>
+                <w:sz w:val="18"/>
+                <w:szCs w:val="18"/>
+              </w:rPr>
+              <w:t xml:space="preserve">What it shows</w:t>
+            </w:r>
+          </w:p>
+        </w:tc>
+      </w:tr>
+      <w:tr>
+        <w:tc>
+          <w:tcPr>
+            <w:tcW w:type="dxa" w:w="3360"/>
+            <w:shd w:fill="FFFFFF" w:val="clear"/>
+            <w:tcMar>
+              <w:top w:type="dxa" w:w="70"/>
+              <w:left w:type="dxa" w:w="110"/>
+              <w:bottom w:type="dxa" w:w="70"/>
+              <w:right w:type="dxa" w:w="110"/>
+            </w:tcMar>
+          </w:tcPr>
+          <w:p>
+            <w:pPr>
+              <w:spacing w:after="0" w:line="250"/>
+            </w:pPr>
+            <w:r>
+              <w:rPr>
+                <w:rFonts w:ascii="Consolas" w:cs="Consolas" w:eastAsia="Consolas" w:hAnsi="Consolas"/>
+                <w:color w:val="9A281B"/>
+                <w:sz w:val="18"/>
+                <w:szCs w:val="18"/>
+              </w:rPr>
+              <w:t xml:space="preserve">prep1</w:t>
+            </w:r>
+          </w:p>
+        </w:tc>
+        <w:tc>
+          <w:tcPr>
+            <w:tcW w:type="dxa" w:w="3360"/>
+            <w:shd w:fill="FFFFFF" w:val="clear"/>
+            <w:tcMar>
+              <w:top w:type="dxa" w:w="70"/>
+              <w:left w:type="dxa" w:w="110"/>
+              <w:bottom w:type="dxa" w:w="70"/>
+              <w:right w:type="dxa" w:w="110"/>
+            </w:tcMar>
+          </w:tcPr>
+          <w:p>
+            <w:pPr>
+              <w:spacing w:after="0" w:line="250"/>
+            </w:pPr>
+            <w:r>
+              <w:rPr>
+                <w:sz w:val="18"/>
+                <w:szCs w:val="18"/>
+              </w:rPr>
+              <w:t xml:space="preserve">Prep-clinic coordinator</w:t>
+            </w:r>
+          </w:p>
+        </w:tc>
+        <w:tc>
+          <w:tcPr>
+            <w:tcW w:type="dxa" w:w="3360"/>
+            <w:shd w:fill="FFFFFF" w:val="clear"/>
+            <w:tcMar>
+              <w:top w:type="dxa" w:w="70"/>
+              <w:left w:type="dxa" w:w="110"/>
+              <w:bottom w:type="dxa" w:w="70"/>
+              <w:right w:type="dxa" w:w="110"/>
+            </w:tcMar>
+          </w:tcPr>
+          <w:p>
+            <w:pPr>
+              <w:spacing w:after="0" w:line="250"/>
+            </w:pPr>
+            <w:r>
+              <w:rPr>
+                <w:sz w:val="18"/>
+                <w:szCs w:val="18"/>
+              </w:rPr>
+              <w:t xml:space="preserve">The handover queue, grouped by team. Registers patients. Weekly and monthly Excel reports</w:t>
+            </w:r>
+          </w:p>
+        </w:tc>
+      </w:tr>
+      <w:tr>
+        <w:tc>
+          <w:tcPr>
+            <w:tcW w:type="dxa" w:w="3360"/>
+            <w:shd w:fill="FFFFFF" w:val="clear"/>
+            <w:tcMar>
+              <w:top w:type="dxa" w:w="70"/>
+              <w:left w:type="dxa" w:w="110"/>
+              <w:bottom w:type="dxa" w:w="70"/>
+              <w:right w:type="dxa" w:w="110"/>
+            </w:tcMar>
+          </w:tcPr>
+          <w:p>
+            <w:pPr>
+              <w:spacing w:after="0" w:line="250"/>
+            </w:pPr>
+            <w:r>
+              <w:rPr>
+                <w:rFonts w:ascii="Consolas" w:cs="Consolas" w:eastAsia="Consolas" w:hAnsi="Consolas"/>
+                <w:color w:val="9A281B"/>
+                <w:sz w:val="18"/>
+                <w:szCs w:val="18"/>
+              </w:rPr>
+              <w:t xml:space="preserve">chair1</w:t>
+            </w:r>
+          </w:p>
+        </w:tc>
+        <w:tc>
+          <w:tcPr>
+            <w:tcW w:type="dxa" w:w="3360"/>
+            <w:shd w:fill="FFFFFF" w:val="clear"/>
+            <w:tcMar>
+              <w:top w:type="dxa" w:w="70"/>
+              <w:left w:type="dxa" w:w="110"/>
+              <w:bottom w:type="dxa" w:w="70"/>
+              <w:right w:type="dxa" w:w="110"/>
+            </w:tcMar>
+          </w:tcPr>
+          <w:p>
+            <w:pPr>
+              <w:spacing w:after="0" w:line="250"/>
+            </w:pPr>
+            <w:r>
+              <w:rPr>
+                <w:sz w:val="18"/>
+                <w:szCs w:val="18"/>
+              </w:rPr>
+              <w:t xml:space="preserve">Chairman</w:t>
+            </w:r>
+          </w:p>
+        </w:tc>
+        <w:tc>
+          <w:tcPr>
+            <w:tcW w:type="dxa" w:w="3360"/>
+            <w:shd w:fill="FFFFFF" w:val="clear"/>
+            <w:tcMar>
+              <w:top w:type="dxa" w:w="70"/>
+              <w:left w:type="dxa" w:w="110"/>
+              <w:bottom w:type="dxa" w:w="70"/>
+              <w:right w:type="dxa" w:w="110"/>
+            </w:tcMar>
+          </w:tcPr>
+          <w:p>
+            <w:pPr>
+              <w:spacing w:after="0" w:line="250"/>
+            </w:pPr>
+            <w:r>
+              <w:rPr>
+                <w:sz w:val="18"/>
+                <w:szCs w:val="18"/>
+              </w:rPr>
+              <w:t xml:space="preserve">All 12 patients across every team, and the reports</w:t>
+            </w:r>
+          </w:p>
+        </w:tc>
+      </w:tr>
+      <w:tr>
+        <w:tc>
+          <w:tcPr>
+            <w:tcW w:type="dxa" w:w="3360"/>
+            <w:shd w:fill="FFFFFF" w:val="clear"/>
+            <w:tcMar>
+              <w:top w:type="dxa" w:w="70"/>
+              <w:left w:type="dxa" w:w="110"/>
+              <w:bottom w:type="dxa" w:w="70"/>
+              <w:right w:type="dxa" w:w="110"/>
+            </w:tcMar>
+          </w:tcPr>
+          <w:p>
+            <w:pPr>
+              <w:spacing w:after="0" w:line="250"/>
+            </w:pPr>
+            <w:r>
+              <w:rPr>
+                <w:rFonts w:ascii="Consolas" w:cs="Consolas" w:eastAsia="Consolas" w:hAnsi="Consolas"/>
+                <w:color w:val="9A281B"/>
+                <w:sz w:val="18"/>
+                <w:szCs w:val="18"/>
+              </w:rPr>
+              <w:t xml:space="preserve">coord2</w:t>
+            </w:r>
+          </w:p>
+        </w:tc>
+        <w:tc>
+          <w:tcPr>
+            <w:tcW w:type="dxa" w:w="3360"/>
+            <w:shd w:fill="FFFFFF" w:val="clear"/>
+            <w:tcMar>
+              <w:top w:type="dxa" w:w="70"/>
+              <w:left w:type="dxa" w:w="110"/>
+              <w:bottom w:type="dxa" w:w="70"/>
+              <w:right w:type="dxa" w:w="110"/>
+            </w:tcMar>
+          </w:tcPr>
+          <w:p>
+            <w:pPr>
+              <w:spacing w:after="0" w:line="250"/>
+            </w:pPr>
+            <w:r>
+              <w:rPr>
+                <w:sz w:val="18"/>
+                <w:szCs w:val="18"/>
+              </w:rPr>
+              <w:t xml:space="preserve">Team nurse coordinator</w:t>
+            </w:r>
+          </w:p>
+        </w:tc>
+        <w:tc>
+          <w:tcPr>
+            <w:tcW w:type="dxa" w:w="3360"/>
+            <w:shd w:fill="FFFFFF" w:val="clear"/>
+            <w:tcMar>
+              <w:top w:type="dxa" w:w="70"/>
+              <w:left w:type="dxa" w:w="110"/>
+              <w:bottom w:type="dxa" w:w="70"/>
+              <w:right w:type="dxa" w:w="110"/>
+            </w:tcMar>
+          </w:tcPr>
+          <w:p>
+            <w:pPr>
+              <w:spacing w:after="0" w:line="250"/>
+            </w:pPr>
+            <w:r>
+              <w:rPr>
+                <w:sz w:val="18"/>
+                <w:szCs w:val="18"/>
+              </w:rPr>
+              <w:t xml:space="preserve">Dr. Amro Mureb's team. Lists patients for MDC and for surgery; assigns fellows to a rotation</w:t>
+            </w:r>
+          </w:p>
+        </w:tc>
+      </w:tr>
+      <w:tr>
+        <w:tc>
+          <w:tcPr>
+            <w:tcW w:type="dxa" w:w="3360"/>
+            <w:shd w:fill="FFFFFF" w:val="clear"/>
+            <w:tcMar>
+              <w:top w:type="dxa" w:w="70"/>
+              <w:left w:type="dxa" w:w="110"/>
+              <w:bottom w:type="dxa" w:w="70"/>
+              <w:right w:type="dxa" w:w="110"/>
+            </w:tcMar>
+          </w:tcPr>
+          <w:p>
+            <w:pPr>
+              <w:spacing w:after="0" w:line="250"/>
+            </w:pPr>
+            <w:r>
+              <w:rPr>
+                <w:rFonts w:ascii="Consolas" w:cs="Consolas" w:eastAsia="Consolas" w:hAnsi="Consolas"/>
+                <w:color w:val="9A281B"/>
+                <w:sz w:val="18"/>
+                <w:szCs w:val="18"/>
+              </w:rPr>
+              <w:t xml:space="preserve">cons2</w:t>
+            </w:r>
+          </w:p>
+        </w:tc>
+        <w:tc>
+          <w:tcPr>
+            <w:tcW w:type="dxa" w:w="3360"/>
+            <w:shd w:fill="FFFFFF" w:val="clear"/>
+            <w:tcMar>
+              <w:top w:type="dxa" w:w="70"/>
+              <w:left w:type="dxa" w:w="110"/>
+              <w:bottom w:type="dxa" w:w="70"/>
+              <w:right w:type="dxa" w:w="110"/>
+            </w:tcMar>
+          </w:tcPr>
+          <w:p>
+            <w:pPr>
+              <w:spacing w:after="0" w:line="250"/>
+            </w:pPr>
+            <w:r>
+              <w:rPr>
+                <w:sz w:val="18"/>
+                <w:szCs w:val="18"/>
+              </w:rPr>
+              <w:t xml:space="preserve">Consultant</w:t>
+            </w:r>
+          </w:p>
+        </w:tc>
+        <w:tc>
+          <w:tcPr>
+            <w:tcW w:type="dxa" w:w="3360"/>
+            <w:shd w:fill="FFFFFF" w:val="clear"/>
+            <w:tcMar>
+              <w:top w:type="dxa" w:w="70"/>
+              <w:left w:type="dxa" w:w="110"/>
+              <w:bottom w:type="dxa" w:w="70"/>
+              <w:right w:type="dxa" w:w="110"/>
+            </w:tcMar>
+          </w:tcPr>
+          <w:p>
+            <w:pPr>
+              <w:spacing w:after="0" w:line="250"/>
+            </w:pPr>
+            <w:r>
+              <w:rPr>
+                <w:sz w:val="18"/>
+                <w:szCs w:val="18"/>
+              </w:rPr>
+              <w:t xml:space="preserve">Dr. Amro Mureb's team, and the team page</w:t>
+            </w:r>
+          </w:p>
+        </w:tc>
+      </w:tr>
+      <w:tr>
+        <w:tc>
+          <w:tcPr>
+            <w:tcW w:type="dxa" w:w="3360"/>
+            <w:shd w:fill="FFFFFF" w:val="clear"/>
+            <w:tcMar>
+              <w:top w:type="dxa" w:w="70"/>
+              <w:left w:type="dxa" w:w="110"/>
+              <w:bottom w:type="dxa" w:w="70"/>
+              <w:right w:type="dxa" w:w="110"/>
+            </w:tcMar>
+          </w:tcPr>
+          <w:p>
+            <w:pPr>
+              <w:spacing w:after="0" w:line="250"/>
+            </w:pPr>
+            <w:r>
+              <w:rPr>
+                <w:rFonts w:ascii="Consolas" w:cs="Consolas" w:eastAsia="Consolas" w:hAnsi="Consolas"/>
+                <w:color w:val="9A281B"/>
+                <w:sz w:val="18"/>
+                <w:szCs w:val="18"/>
+              </w:rPr>
+              <w:t xml:space="preserve">fellow1</w:t>
+            </w:r>
+          </w:p>
+        </w:tc>
+        <w:tc>
+          <w:tcPr>
+            <w:tcW w:type="dxa" w:w="3360"/>
+            <w:shd w:fill="FFFFFF" w:val="clear"/>
+            <w:tcMar>
+              <w:top w:type="dxa" w:w="70"/>
+              <w:left w:type="dxa" w:w="110"/>
+              <w:bottom w:type="dxa" w:w="70"/>
+              <w:right w:type="dxa" w:w="110"/>
+            </w:tcMar>
+          </w:tcPr>
+          <w:p>
+            <w:pPr>
+              <w:spacing w:after="0" w:line="250"/>
+            </w:pPr>
+            <w:r>
+              <w:rPr>
+                <w:sz w:val="18"/>
+                <w:szCs w:val="18"/>
+              </w:rPr>
+              <w:t xml:space="preserve">Fellow</w:t>
+            </w:r>
+          </w:p>
+        </w:tc>
+        <w:tc>
+          <w:tcPr>
+            <w:tcW w:type="dxa" w:w="3360"/>
+            <w:shd w:fill="FFFFFF" w:val="clear"/>
+            <w:tcMar>
+              <w:top w:type="dxa" w:w="70"/>
+              <w:left w:type="dxa" w:w="110"/>
+              <w:bottom w:type="dxa" w:w="70"/>
+              <w:right w:type="dxa" w:w="110"/>
+            </w:tcMar>
+          </w:tcPr>
+          <w:p>
+            <w:pPr>
+              <w:spacing w:after="0" w:line="250"/>
+            </w:pPr>
+            <w:r>
+              <w:rPr>
+                <w:sz w:val="18"/>
+                <w:szCs w:val="18"/>
+              </w:rPr>
+              <w:t xml:space="preserve">Dr. Amro Mureb's team, via a current rotation. Runs the workup, records decisions, builds slides</w:t>
+            </w:r>
+          </w:p>
+        </w:tc>
+      </w:tr>
+      <w:tr>
+        <w:tc>
+          <w:tcPr>
+            <w:tcW w:type="dxa" w:w="3360"/>
+            <w:shd w:fill="FFFFFF" w:val="clear"/>
+            <w:tcMar>
+              <w:top w:type="dxa" w:w="70"/>
+              <w:left w:type="dxa" w:w="110"/>
+              <w:bottom w:type="dxa" w:w="70"/>
+              <w:right w:type="dxa" w:w="110"/>
+            </w:tcMar>
+          </w:tcPr>
+          <w:p>
+            <w:pPr>
+              <w:spacing w:after="0" w:line="250"/>
+            </w:pPr>
+            <w:r>
+              <w:rPr>
+                <w:rFonts w:ascii="Consolas" w:cs="Consolas" w:eastAsia="Consolas" w:hAnsi="Consolas"/>
+                <w:color w:val="9A281B"/>
+                <w:sz w:val="18"/>
+                <w:szCs w:val="18"/>
+              </w:rPr>
+              <w:t xml:space="preserve">coord1</w:t>
+            </w:r>
+            <w:r>
+              <w:rPr>
+                <w:sz w:val="18"/>
+                <w:szCs w:val="18"/>
+              </w:rPr>
+              <w:t xml:space="preserve"> / </w:t>
+            </w:r>
+            <w:r>
+              <w:rPr>
+                <w:rFonts w:ascii="Consolas" w:cs="Consolas" w:eastAsia="Consolas" w:hAnsi="Consolas"/>
+                <w:color w:val="9A281B"/>
+                <w:sz w:val="18"/>
+                <w:szCs w:val="18"/>
+              </w:rPr>
+              <w:t xml:space="preserve">cons1</w:t>
+            </w:r>
+            <w:r>
+              <w:rPr>
+                <w:sz w:val="18"/>
+                <w:szCs w:val="18"/>
+              </w:rPr>
+              <w:t xml:space="preserve"> / </w:t>
+            </w:r>
+            <w:r>
+              <w:rPr>
+                <w:rFonts w:ascii="Consolas" w:cs="Consolas" w:eastAsia="Consolas" w:hAnsi="Consolas"/>
+                <w:color w:val="9A281B"/>
+                <w:sz w:val="18"/>
+                <w:szCs w:val="18"/>
+              </w:rPr>
+              <w:t xml:space="preserve">fellow2</w:t>
+            </w:r>
+          </w:p>
+        </w:tc>
+        <w:tc>
+          <w:tcPr>
+            <w:tcW w:type="dxa" w:w="3360"/>
+            <w:shd w:fill="FFFFFF" w:val="clear"/>
+            <w:tcMar>
+              <w:top w:type="dxa" w:w="70"/>
+              <w:left w:type="dxa" w:w="110"/>
+              <w:bottom w:type="dxa" w:w="70"/>
+              <w:right w:type="dxa" w:w="110"/>
+            </w:tcMar>
+          </w:tcPr>
+          <w:p>
+            <w:pPr>
+              <w:spacing w:after="0" w:line="250"/>
+            </w:pPr>
+            <w:r>
+              <w:rPr>
+                <w:sz w:val="18"/>
+                <w:szCs w:val="18"/>
+              </w:rPr>
+              <w:t xml:space="preserve">The same three roles</w:t>
+            </w:r>
+          </w:p>
+        </w:tc>
+        <w:tc>
+          <w:tcPr>
+            <w:tcW w:type="dxa" w:w="3360"/>
+            <w:shd w:fill="FFFFFF" w:val="clear"/>
+            <w:tcMar>
+              <w:top w:type="dxa" w:w="70"/>
+              <w:left w:type="dxa" w:w="110"/>
+              <w:bottom w:type="dxa" w:w="70"/>
+              <w:right w:type="dxa" w:w="110"/>
+            </w:tcMar>
+          </w:tcPr>
+          <w:p>
+            <w:pPr>
+              <w:spacing w:after="0" w:line="250"/>
+            </w:pPr>
+            <w:r>
+              <w:rPr>
+                <w:sz w:val="18"/>
+                <w:szCs w:val="18"/>
+              </w:rPr>
+              <w:t xml:space="preserve">Dr. Fade Alawneh's breast team — useful for checking that one team cannot see another</w:t>
+            </w:r>
+          </w:p>
+        </w:tc>
+      </w:tr>
+      <w:tr>
+        <w:tc>
+          <w:tcPr>
+            <w:tcW w:type="dxa" w:w="3360"/>
+            <w:shd w:fill="FFFFFF" w:val="clear"/>
+            <w:tcMar>
+              <w:top w:type="dxa" w:w="70"/>
+              <w:left w:type="dxa" w:w="110"/>
+              <w:bottom w:type="dxa" w:w="70"/>
+              <w:right w:type="dxa" w:w="110"/>
+            </w:tcMar>
+          </w:tcPr>
+          <w:p>
+            <w:pPr>
+              <w:spacing w:after="0" w:line="250"/>
+            </w:pPr>
+            <w:r>
+              <w:rPr>
+                <w:rFonts w:ascii="Consolas" w:cs="Consolas" w:eastAsia="Consolas" w:hAnsi="Consolas"/>
+                <w:color w:val="9A281B"/>
+                <w:sz w:val="18"/>
+                <w:szCs w:val="18"/>
+              </w:rPr>
+              <w:t xml:space="preserve">mdc1</w:t>
+            </w:r>
+          </w:p>
+        </w:tc>
+        <w:tc>
+          <w:tcPr>
+            <w:tcW w:type="dxa" w:w="3360"/>
+            <w:shd w:fill="FFFFFF" w:val="clear"/>
+            <w:tcMar>
+              <w:top w:type="dxa" w:w="70"/>
+              <w:left w:type="dxa" w:w="110"/>
+              <w:bottom w:type="dxa" w:w="70"/>
+              <w:right w:type="dxa" w:w="110"/>
+            </w:tcMar>
+          </w:tcPr>
+          <w:p>
+            <w:pPr>
+              <w:spacing w:after="0" w:line="250"/>
+            </w:pPr>
+            <w:r>
+              <w:rPr>
+                <w:sz w:val="18"/>
+                <w:szCs w:val="18"/>
+              </w:rPr>
+              <w:t xml:space="preserve">MDC coordinator</w:t>
+            </w:r>
+          </w:p>
+        </w:tc>
+        <w:tc>
+          <w:tcPr>
+            <w:tcW w:type="dxa" w:w="3360"/>
+            <w:shd w:fill="FFFFFF" w:val="clear"/>
+            <w:tcMar>
+              <w:top w:type="dxa" w:w="70"/>
+              <w:left w:type="dxa" w:w="110"/>
+              <w:bottom w:type="dxa" w:w="70"/>
+              <w:right w:type="dxa" w:w="110"/>
+            </w:tcMar>
+          </w:tcPr>
+          <w:p>
+            <w:pPr>
+              <w:spacing w:after="0" w:line="250"/>
+            </w:pPr>
+            <w:r>
+              <w:rPr>
+                <w:sz w:val="18"/>
+                <w:szCs w:val="18"/>
+              </w:rPr>
+              <w:t xml:space="preserve">Only the patients listed on the Breast MDC</w:t>
+            </w:r>
+          </w:p>
+        </w:tc>
+      </w:tr>
+    </w:tbl>
+    <w:p>
+      <w:pPr>
+        <w:spacing w:after="160"/>
+      </w:pPr>
+      <w:r>
+        <w:t xml:space="preserve"/>
+      </w:r>
+    </w:p>
+    <w:p>
+      <w:pPr>
+        <w:spacing w:after="130" w:line="276"/>
+      </w:pPr>
+      <w:r>
+        <w:t xml:space="preserve">All nine use the password </w:t>
+      </w:r>
+      <w:r>
+        <w:rPr>
+          <w:b/>
+          <w:bCs/>
+        </w:rPr>
+        <w:t xml:space="preserve">`demo1234`</w:t>
+      </w:r>
+      <w:r>
+        <w:t xml:space="preserve">, and all nine were checked against the deployed instance. There is deliberately </w:t>
+      </w:r>
+      <w:r>
+        <w:rPr>
+          <w:b/>
+          <w:bCs/>
+        </w:rPr>
+        <w:t xml:space="preserve">no superuser</w:t>
+      </w:r>
+      <w:r>
+        <w:t xml:space="preserve">, so </w:t>
       </w:r>
       <w:r>
         <w:rPr>
@@ -21033,82 +21791,10 @@
           <w:sz w:val="18"/>
           <w:szCs w:val="18"/>
         </w:rPr>
-        <w:t xml:space="preserve">demo1234</w:t>
-      </w:r>
-      <w:r>
-        <w:t xml:space="preserve">: </w:t>
-      </w:r>
-      <w:r>
-        <w:rPr>
-          <w:rFonts w:ascii="Consolas" w:cs="Consolas" w:eastAsia="Consolas" w:hAnsi="Consolas"/>
-          <w:color w:val="9A281B"/>
-          <w:sz w:val="18"/>
-          <w:szCs w:val="18"/>
-        </w:rPr>
-        <w:t xml:space="preserve">prep1</w:t>
-      </w:r>
-      <w:r>
-        <w:t xml:space="preserve"> (prep coordinator), </w:t>
-      </w:r>
-      <w:r>
-        <w:rPr>
-          <w:rFonts w:ascii="Consolas" w:cs="Consolas" w:eastAsia="Consolas" w:hAnsi="Consolas"/>
-          <w:color w:val="9A281B"/>
-          <w:sz w:val="18"/>
-          <w:szCs w:val="18"/>
-        </w:rPr>
-        <w:t xml:space="preserve">chair1</w:t>
-      </w:r>
-      <w:r>
-        <w:t xml:space="preserve"> (chairman), </w:t>
-      </w:r>
-      <w:r>
-        <w:rPr>
-          <w:rFonts w:ascii="Consolas" w:cs="Consolas" w:eastAsia="Consolas" w:hAnsi="Consolas"/>
-          <w:color w:val="9A281B"/>
-          <w:sz w:val="18"/>
-          <w:szCs w:val="18"/>
-        </w:rPr>
-        <w:t xml:space="preserve">coord2</w:t>
-      </w:r>
-      <w:r>
-        <w:t xml:space="preserve"> (team coordinator), </w:t>
-      </w:r>
-      <w:r>
-        <w:rPr>
-          <w:rFonts w:ascii="Consolas" w:cs="Consolas" w:eastAsia="Consolas" w:hAnsi="Consolas"/>
-          <w:color w:val="9A281B"/>
-          <w:sz w:val="18"/>
-          <w:szCs w:val="18"/>
-        </w:rPr>
-        <w:t xml:space="preserve">cons2</w:t>
-      </w:r>
-      <w:r>
-        <w:t xml:space="preserve"> (consultant), </w:t>
-      </w:r>
-      <w:r>
-        <w:rPr>
-          <w:rFonts w:ascii="Consolas" w:cs="Consolas" w:eastAsia="Consolas" w:hAnsi="Consolas"/>
-          <w:color w:val="9A281B"/>
-          <w:sz w:val="18"/>
-          <w:szCs w:val="18"/>
-        </w:rPr>
-        <w:t xml:space="preserve">fellow1</w:t>
-      </w:r>
-      <w:r>
-        <w:t xml:space="preserve"> (fellow), </w:t>
-      </w:r>
-      <w:r>
-        <w:rPr>
-          <w:rFonts w:ascii="Consolas" w:cs="Consolas" w:eastAsia="Consolas" w:hAnsi="Consolas"/>
-          <w:color w:val="9A281B"/>
-          <w:sz w:val="18"/>
-          <w:szCs w:val="18"/>
-        </w:rPr>
-        <w:t xml:space="preserve">mdc1</w:t>
-      </w:r>
-      <w:r>
-        <w:t xml:space="preserve"> (MDC coordinator).</w:t>
+        <w:t xml:space="preserve">/admin/</w:t>
+      </w:r>
+      <w:r>
+        <w:t xml:space="preserve"> cannot be logged into.</w:t>
       </w:r>
     </w:p>
     <w:p>

</xml_diff>